<commit_message>
update grade to 90
Instructor adjustment: the one-point JavaScript deduction for an
untranslated aria attribute is dropped. No student code is modified.

Co-Authored-By: Claude Fable 5.1 <noreply@anthropic.com>
</commit_message>
<xml_diff>
--- a/feedback/Giovanny-Rodriguez-Project-1-Feedback.docx
+++ b/feedback/Giovanny-Rodriguez-Project-1-Feedback.docx
@@ -74,7 +74,7 @@
         </w:rPr>
         <w:t xml:space="preserve">Repo: </w:t>
       </w:r>
-      <w:hyperlink w:history="1" r:id="rIdtttuksu48xjftbd_xad3t">
+      <w:hyperlink w:history="1" r:id="rIdegrrvuyh6ept6xl2ggb0t">
         <w:r>
           <w:rPr>
             <w:rStyle w:val="Hyperlink"/>
@@ -92,7 +92,7 @@
         </w:rPr>
         <w:t xml:space="preserve">Live: </w:t>
       </w:r>
-      <w:hyperlink w:history="1" r:id="rId4xfrovrvcfijhwhc39qnr">
+      <w:hyperlink w:history="1" r:id="rIdcsj9l4oqxqnfbtdpuul3-">
         <w:r>
           <w:rPr>
             <w:rStyle w:val="Hyperlink"/>
@@ -120,7 +120,7 @@
           <w:sz w:val="40"/>
           <w:szCs w:val="40"/>
         </w:rPr>
-        <w:t xml:space="preserve">Grade: 89 / 100</w:t>
+        <w:t xml:space="preserve">Grade: 90 / 100</w:t>
       </w:r>
     </w:p>
     <w:tbl>
@@ -602,7 +602,7 @@
                 <w:b w:val="false"/>
                 <w:bCs w:val="false"/>
               </w:rPr>
-              <w:t xml:space="preserve">14</w:t>
+              <w:t xml:space="preserve">15</w:t>
             </w:r>
           </w:p>
         </w:tc>
@@ -625,7 +625,7 @@
                 <w:b w:val="false"/>
                 <w:bCs w:val="false"/>
               </w:rPr>
-              <w:t xml:space="preserve">A menu, keyboard-accessible tabs, and a real 3D projection of a real molecule, all verified; one Spanish leftover in an aria attribute</w:t>
+              <w:t xml:space="preserve">A menu, keyboard-accessible tabs, and a real 3D projection of a real molecule, all verified</w:t>
             </w:r>
           </w:p>
         </w:tc>
@@ -893,7 +893,7 @@
                 <w:b w:val="false"/>
                 <w:bCs w:val="false"/>
               </w:rPr>
-              <w:t xml:space="preserve">89</w:t>
+              <w:t xml:space="preserve">90</w:t>
             </w:r>
           </w:p>
         </w:tc>
@@ -2308,7 +2308,7 @@
         <w:spacing w:after="120" w:before="360"/>
       </w:pPr>
       <w:r>
-        <w:t xml:space="preserve">JavaScript interaction: 14 / 15</w:t>
+        <w:t xml:space="preserve">JavaScript interaction: 15 / 15</w:t>
       </w:r>
     </w:p>
     <w:p>
@@ -2805,7 +2805,7 @@
         <w:spacing w:after="120"/>
       </w:pPr>
       <w:r>
-        <w:t xml:space="preserve">If those five come easily, this is an 89 that was earned, and you should be proud of it.</w:t>
+        <w:t xml:space="preserve">If those five come easily, this is a 90 that was earned, and you should be proud of it.</w:t>
       </w:r>
     </w:p>
     <w:p>

</xml_diff>